<commit_message>
Fluency Lab: Module 5 worksheets cleaned up; all 8 Google Form builders match the new Skill Checks (no word problems or multi-step)
Co-Authored-By: Claude Opus 5.5 <noreply@anthropic.com>
Claude-Session: https://claude.ai/code/session_014YTiyifGRnSLg5sxKHwHzH
</commit_message>
<xml_diff>
--- a/grade8/Fluency-Lab-Package/module-materials/Module-5-Decimals/FluencyLab_M5_Mixed_Review.docx
+++ b/grade8/Fluency-Lab-Package/module-materials/Module-5-Decimals/FluencyLab_M5_Mixed_Review.docx
@@ -133,7 +133,7 @@
           <w:sz w:val="22"/>
           <w:szCs w:val="22"/>
         </w:rPr>
-        <w:t xml:space="preserve">Operations and conversions together. Ask: do the places line up, and is this a percent, a decimal, or a fraction?</w:t>
+        <w:t xml:space="preserve">Line up the decimal points.</w:t>
       </w:r>
     </w:p>
     <w:p>
@@ -247,7 +247,7 @@
                 <w:sz w:val="22"/>
                 <w:szCs w:val="22"/>
               </w:rPr>
-              <w:t xml:space="preserve">Write 0.75 as a %  =  ______</w:t>
+              <w:t xml:space="preserve">0.75  =  ______ %</w:t>
             </w:r>
           </w:p>
         </w:tc>
@@ -353,29 +353,247 @@
               <w:right w:type="dxa" w:w="120"/>
             </w:tcMar>
           </w:tcPr>
+          <w:tbl>
+            <w:tblPr>
+              <w:tblW w:type="dxa" w:w="3540"/>
+              <w:jc w:val="left"/>
+              <w:tblBorders>
+                <w:top w:val="single" w:color="auto" w:sz="4"/>
+                <w:left w:val="single" w:color="auto" w:sz="4"/>
+                <w:bottom w:val="single" w:color="auto" w:sz="4"/>
+                <w:right w:val="single" w:color="auto" w:sz="4"/>
+                <w:insideH w:val="single" w:color="auto" w:sz="4"/>
+                <w:insideV w:val="single" w:color="auto" w:sz="4"/>
+              </w:tblBorders>
+            </w:tblPr>
+            <w:tblGrid>
+              <w:gridCol w:w="420"/>
+              <w:gridCol w:w="700"/>
+              <w:gridCol w:w="520"/>
+              <w:gridCol w:w="1900"/>
+            </w:tblGrid>
+            <w:tr>
+              <w:tc>
+                <w:tcPr>
+                  <w:tcW w:type="dxa" w:w="420"/>
+                  <w:tcBorders>
+                    <w:top w:val="none" w:color="FFFFFF" w:sz="0"/>
+                    <w:left w:val="none" w:color="FFFFFF" w:sz="0"/>
+                    <w:bottom w:val="none" w:color="FFFFFF" w:sz="0"/>
+                    <w:right w:val="none" w:color="FFFFFF" w:sz="0"/>
+                  </w:tcBorders>
+                  <w:tcMar>
+                    <w:top w:type="dxa" w:w="30"/>
+                    <w:left w:type="dxa" w:w="0"/>
+                    <w:bottom w:type="dxa" w:w="30"/>
+                    <w:right w:type="dxa" w:w="10"/>
+                  </w:tcMar>
+                  <w:vAlign w:val="center"/>
+                </w:tcPr>
+                <w:p>
+                  <w:pPr>
+                    <w:spacing w:after="0"/>
+                  </w:pPr>
+                  <w:r>
+                    <w:rPr>
+                      <w:b/>
+                      <w:bCs/>
+                      <w:color w:val="2E5A87"/>
+                      <w:sz w:val="20"/>
+                      <w:szCs w:val="20"/>
+                    </w:rPr>
+                    <w:t xml:space="preserve">5)</w:t>
+                  </w:r>
+                </w:p>
+              </w:tc>
+              <w:tc>
+                <w:tcPr>
+                  <w:tcW w:type="dxa" w:w="700"/>
+                  <w:tcBorders>
+                    <w:top w:val="none" w:color="FFFFFF" w:sz="0"/>
+                    <w:left w:val="none" w:color="FFFFFF" w:sz="0"/>
+                    <w:bottom w:val="none" w:color="FFFFFF" w:sz="0"/>
+                    <w:right w:val="none" w:color="FFFFFF" w:sz="0"/>
+                  </w:tcBorders>
+                  <w:tcMar>
+                    <w:top w:type="dxa" w:w="30"/>
+                    <w:left w:type="dxa" w:w="20"/>
+                    <w:bottom w:type="dxa" w:w="30"/>
+                    <w:right w:type="dxa" w:w="20"/>
+                  </w:tcMar>
+                  <w:vAlign w:val="center"/>
+                </w:tcPr>
+                <w:tbl>
+                  <w:tblPr>
+                    <w:tblW w:type="dxa" w:w="600"/>
+                    <w:jc w:val="center"/>
+                    <w:tblBorders>
+                      <w:top w:val="single" w:color="auto" w:sz="4"/>
+                      <w:left w:val="single" w:color="auto" w:sz="4"/>
+                      <w:bottom w:val="single" w:color="auto" w:sz="4"/>
+                      <w:right w:val="single" w:color="auto" w:sz="4"/>
+                      <w:insideH w:val="none" w:color="FFFFFF" w:sz="0"/>
+                      <w:insideV w:val="single" w:color="auto" w:sz="4"/>
+                    </w:tblBorders>
+                  </w:tblPr>
+                  <w:tblGrid>
+                    <w:gridCol w:w="600"/>
+                  </w:tblGrid>
+                  <w:tr>
+                    <w:tc>
+                      <w:tcPr>
+                        <w:tcW w:type="dxa" w:w="520"/>
+                        <w:tcBorders>
+                          <w:top w:val="none" w:color="FFFFFF" w:sz="0"/>
+                          <w:left w:val="none" w:color="FFFFFF" w:sz="0"/>
+                          <w:bottom w:val="single" w:color="1A1A1A" w:sz="8"/>
+                          <w:right w:val="none" w:color="FFFFFF" w:sz="0"/>
+                        </w:tcBorders>
+                        <w:tcMar>
+                          <w:top w:type="dxa" w:w="0"/>
+                          <w:left w:type="dxa" w:w="30"/>
+                          <w:bottom w:type="dxa" w:w="0"/>
+                          <w:right w:type="dxa" w:w="30"/>
+                        </w:tcMar>
+                      </w:tcPr>
+                      <w:p>
+                        <w:pPr>
+                          <w:spacing w:after="0" w:line="230"/>
+                          <w:jc w:val="center"/>
+                        </w:pPr>
+                        <w:r>
+                          <w:rPr>
+                            <w:rFonts w:ascii="Consolas" w:cs="Consolas" w:eastAsia="Consolas" w:hAnsi="Consolas"/>
+                            <w:b/>
+                            <w:bCs/>
+                            <w:color w:val="1A1A1A"/>
+                            <w:sz w:val="26"/>
+                            <w:szCs w:val="26"/>
+                          </w:rPr>
+                          <w:t xml:space="preserve">3</w:t>
+                        </w:r>
+                      </w:p>
+                    </w:tc>
+                  </w:tr>
+                  <w:tr>
+                    <w:tc>
+                      <w:tcPr>
+                        <w:tcW w:type="dxa" w:w="520"/>
+                        <w:tcBorders>
+                          <w:top w:val="none" w:color="FFFFFF" w:sz="0"/>
+                          <w:left w:val="none" w:color="FFFFFF" w:sz="0"/>
+                          <w:bottom w:val="none" w:color="FFFFFF" w:sz="0"/>
+                          <w:right w:val="none" w:color="FFFFFF" w:sz="0"/>
+                        </w:tcBorders>
+                        <w:tcMar>
+                          <w:top w:type="dxa" w:w="0"/>
+                          <w:left w:type="dxa" w:w="30"/>
+                          <w:bottom w:type="dxa" w:w="0"/>
+                          <w:right w:type="dxa" w:w="30"/>
+                        </w:tcMar>
+                      </w:tcPr>
+                      <w:p>
+                        <w:pPr>
+                          <w:spacing w:after="0" w:line="230"/>
+                          <w:jc w:val="center"/>
+                        </w:pPr>
+                        <w:r>
+                          <w:rPr>
+                            <w:rFonts w:ascii="Consolas" w:cs="Consolas" w:eastAsia="Consolas" w:hAnsi="Consolas"/>
+                            <w:b/>
+                            <w:bCs/>
+                            <w:color w:val="1A1A1A"/>
+                            <w:sz w:val="26"/>
+                            <w:szCs w:val="26"/>
+                          </w:rPr>
+                          <w:t xml:space="preserve">4</w:t>
+                        </w:r>
+                      </w:p>
+                    </w:tc>
+                  </w:tr>
+                </w:tbl>
+                <w:p/>
+              </w:tc>
+              <w:tc>
+                <w:tcPr>
+                  <w:tcW w:type="dxa" w:w="520"/>
+                  <w:tcBorders>
+                    <w:top w:val="none" w:color="FFFFFF" w:sz="0"/>
+                    <w:left w:val="none" w:color="FFFFFF" w:sz="0"/>
+                    <w:bottom w:val="none" w:color="FFFFFF" w:sz="0"/>
+                    <w:right w:val="none" w:color="FFFFFF" w:sz="0"/>
+                  </w:tcBorders>
+                  <w:tcMar>
+                    <w:top w:type="dxa" w:w="30"/>
+                    <w:left w:type="dxa" w:w="10"/>
+                    <w:bottom w:type="dxa" w:w="30"/>
+                    <w:right w:type="dxa" w:w="10"/>
+                  </w:tcMar>
+                  <w:vAlign w:val="center"/>
+                </w:tcPr>
+                <w:p>
+                  <w:pPr>
+                    <w:jc w:val="center"/>
+                  </w:pPr>
+                  <w:r>
+                    <w:rPr>
+                      <w:rFonts w:ascii="Consolas" w:cs="Consolas" w:eastAsia="Consolas" w:hAnsi="Consolas"/>
+                      <w:b/>
+                      <w:bCs/>
+                      <w:color w:val="7A86A8"/>
+                      <w:sz w:val="26"/>
+                      <w:szCs w:val="26"/>
+                    </w:rPr>
+                    <w:t xml:space="preserve">=</w:t>
+                  </w:r>
+                </w:p>
+              </w:tc>
+              <w:tc>
+                <w:tcPr>
+                  <w:tcW w:type="dxa" w:w="1900"/>
+                  <w:tcBorders>
+                    <w:top w:val="none" w:color="FFFFFF" w:sz="0"/>
+                    <w:left w:val="none" w:color="FFFFFF" w:sz="0"/>
+                    <w:bottom w:val="none" w:color="FFFFFF" w:sz="0"/>
+                    <w:right w:val="none" w:color="FFFFFF" w:sz="0"/>
+                  </w:tcBorders>
+                  <w:tcMar>
+                    <w:top w:type="dxa" w:w="30"/>
+                    <w:left w:type="dxa" w:w="10"/>
+                    <w:bottom w:type="dxa" w:w="30"/>
+                    <w:right w:type="dxa" w:w="10"/>
+                  </w:tcMar>
+                  <w:vAlign w:val="center"/>
+                </w:tcPr>
+                <w:p>
+                  <w:pPr>
+                    <w:spacing w:after="0"/>
+                  </w:pPr>
+                  <w:r>
+                    <w:rPr>
+                      <w:rFonts w:ascii="Consolas" w:cs="Consolas" w:eastAsia="Consolas" w:hAnsi="Consolas"/>
+                      <w:color w:val="1A1A1A"/>
+                      <w:sz w:val="22"/>
+                      <w:szCs w:val="22"/>
+                    </w:rPr>
+                    <w:t xml:space="preserve">______</w:t>
+                  </w:r>
+                  <w:r>
+                    <w:rPr>
+                      <w:color w:val="7A86A8"/>
+                      <w:sz w:val="18"/>
+                      <w:szCs w:val="18"/>
+                    </w:rPr>
+                    <w:t xml:space="preserve">  (decimal)</w:t>
+                  </w:r>
+                </w:p>
+              </w:tc>
+            </w:tr>
+          </w:tbl>
           <w:p>
             <w:pPr>
-              <w:spacing w:line="320"/>
+              <w:spacing w:after="0" w:line="120" w:lineRule="exact"/>
             </w:pPr>
-            <w:r>
-              <w:rPr>
-                <w:b/>
-                <w:bCs/>
-                <w:color w:val="2E5A87"/>
-                <w:sz w:val="20"/>
-                <w:szCs w:val="20"/>
-              </w:rPr>
-              <w:t xml:space="preserve">5)  </w:t>
-            </w:r>
-            <w:r>
-              <w:rPr>
-                <w:rFonts w:ascii="Consolas" w:cs="Consolas" w:eastAsia="Consolas" w:hAnsi="Consolas"/>
-                <w:color w:val="1A1A1A"/>
-                <w:sz w:val="22"/>
-                <w:szCs w:val="22"/>
-              </w:rPr>
-              <w:t xml:space="preserve">Write 3/4 as a decimal  =  ______</w:t>
-            </w:r>
           </w:p>
         </w:tc>
         <w:tc>
@@ -393,6 +611,7 @@
               <w:bottom w:type="dxa" w:w="110"/>
               <w:right w:type="dxa" w:w="120"/>
             </w:tcMar>
+            <w:vAlign w:val="center"/>
           </w:tcPr>
           <w:p>
             <w:pPr>
@@ -470,37 +689,1780 @@
               <w:right w:type="dxa" w:w="170"/>
             </w:tcMar>
           </w:tcPr>
+          <w:tbl>
+            <w:tblPr>
+              <w:tblW w:type="dxa" w:w="9020"/>
+              <w:jc w:val="left"/>
+              <w:tblBorders>
+                <w:top w:val="single" w:color="auto" w:sz="4"/>
+                <w:left w:val="single" w:color="auto" w:sz="4"/>
+                <w:bottom w:val="single" w:color="auto" w:sz="4"/>
+                <w:right w:val="single" w:color="auto" w:sz="4"/>
+                <w:insideH w:val="single" w:color="auto" w:sz="4"/>
+                <w:insideV w:val="single" w:color="auto" w:sz="4"/>
+              </w:tblBorders>
+            </w:tblPr>
+            <w:tblGrid>
+              <w:gridCol w:w="4510"/>
+              <w:gridCol w:w="4510"/>
+            </w:tblGrid>
+            <w:tr>
+              <w:tc>
+                <w:tcPr>
+                  <w:tcW w:type="dxa" w:w="4510"/>
+                  <w:tcBorders>
+                    <w:top w:val="none" w:color="FFFFFF" w:sz="0"/>
+                    <w:left w:val="none" w:color="FFFFFF" w:sz="0"/>
+                    <w:bottom w:val="none" w:color="FFFFFF" w:sz="0"/>
+                    <w:right w:val="none" w:color="FFFFFF" w:sz="0"/>
+                  </w:tcBorders>
+                  <w:tcMar>
+                    <w:top w:type="dxa" w:w="30"/>
+                    <w:left w:type="dxa" w:w="0"/>
+                    <w:bottom w:type="dxa" w:w="60"/>
+                    <w:right w:type="dxa" w:w="0"/>
+                  </w:tcMar>
+                </w:tcPr>
+                <w:tbl>
+                  <w:tblPr>
+                    <w:tblW w:type="dxa" w:w="3180"/>
+                    <w:jc w:val="left"/>
+                    <w:tblBorders>
+                      <w:top w:val="single" w:color="auto" w:sz="4"/>
+                      <w:left w:val="single" w:color="auto" w:sz="4"/>
+                      <w:bottom w:val="single" w:color="auto" w:sz="4"/>
+                      <w:right w:val="single" w:color="auto" w:sz="4"/>
+                      <w:insideH w:val="single" w:color="auto" w:sz="4"/>
+                      <w:insideV w:val="single" w:color="auto" w:sz="4"/>
+                    </w:tblBorders>
+                  </w:tblPr>
+                  <w:tblGrid>
+                    <w:gridCol w:w="700"/>
+                    <w:gridCol w:w="520"/>
+                    <w:gridCol w:w="700"/>
+                    <w:gridCol w:w="520"/>
+                    <w:gridCol w:w="740"/>
+                  </w:tblGrid>
+                  <w:tr>
+                    <w:tc>
+                      <w:tcPr>
+                        <w:tcW w:type="dxa" w:w="700"/>
+                        <w:tcBorders>
+                          <w:top w:val="none" w:color="FFFFFF" w:sz="0"/>
+                          <w:left w:val="none" w:color="FFFFFF" w:sz="0"/>
+                          <w:bottom w:val="none" w:color="FFFFFF" w:sz="0"/>
+                          <w:right w:val="none" w:color="FFFFFF" w:sz="0"/>
+                        </w:tcBorders>
+                        <w:tcMar>
+                          <w:top w:type="dxa" w:w="30"/>
+                          <w:left w:type="dxa" w:w="20"/>
+                          <w:bottom w:type="dxa" w:w="30"/>
+                          <w:right w:type="dxa" w:w="20"/>
+                        </w:tcMar>
+                        <w:vAlign w:val="center"/>
+                      </w:tcPr>
+                      <w:tbl>
+                        <w:tblPr>
+                          <w:tblW w:type="dxa" w:w="600"/>
+                          <w:jc w:val="center"/>
+                          <w:tblBorders>
+                            <w:top w:val="single" w:color="auto" w:sz="4"/>
+                            <w:left w:val="single" w:color="auto" w:sz="4"/>
+                            <w:bottom w:val="single" w:color="auto" w:sz="4"/>
+                            <w:right w:val="single" w:color="auto" w:sz="4"/>
+                            <w:insideH w:val="none" w:color="FFFFFF" w:sz="0"/>
+                            <w:insideV w:val="single" w:color="auto" w:sz="4"/>
+                          </w:tblBorders>
+                        </w:tblPr>
+                        <w:tblGrid>
+                          <w:gridCol w:w="600"/>
+                        </w:tblGrid>
+                        <w:tr>
+                          <w:tc>
+                            <w:tcPr>
+                              <w:tcW w:type="dxa" w:w="520"/>
+                              <w:tcBorders>
+                                <w:top w:val="none" w:color="FFFFFF" w:sz="0"/>
+                                <w:left w:val="none" w:color="FFFFFF" w:sz="0"/>
+                                <w:bottom w:val="single" w:color="1A1A1A" w:sz="8"/>
+                                <w:right w:val="none" w:color="FFFFFF" w:sz="0"/>
+                              </w:tcBorders>
+                              <w:tcMar>
+                                <w:top w:type="dxa" w:w="0"/>
+                                <w:left w:type="dxa" w:w="30"/>
+                                <w:bottom w:type="dxa" w:w="0"/>
+                                <w:right w:type="dxa" w:w="30"/>
+                              </w:tcMar>
+                            </w:tcPr>
+                            <w:p>
+                              <w:pPr>
+                                <w:spacing w:after="0" w:line="230"/>
+                                <w:jc w:val="center"/>
+                              </w:pPr>
+                              <w:r>
+                                <w:rPr>
+                                  <w:rFonts w:ascii="Consolas" w:cs="Consolas" w:eastAsia="Consolas" w:hAnsi="Consolas"/>
+                                  <w:b/>
+                                  <w:bCs/>
+                                  <w:color w:val="1A1A1A"/>
+                                  <w:sz w:val="26"/>
+                                  <w:szCs w:val="26"/>
+                                </w:rPr>
+                                <w:t xml:space="preserve">1</w:t>
+                              </w:r>
+                            </w:p>
+                          </w:tc>
+                        </w:tr>
+                        <w:tr>
+                          <w:tc>
+                            <w:tcPr>
+                              <w:tcW w:type="dxa" w:w="520"/>
+                              <w:tcBorders>
+                                <w:top w:val="none" w:color="FFFFFF" w:sz="0"/>
+                                <w:left w:val="none" w:color="FFFFFF" w:sz="0"/>
+                                <w:bottom w:val="none" w:color="FFFFFF" w:sz="0"/>
+                                <w:right w:val="none" w:color="FFFFFF" w:sz="0"/>
+                              </w:tcBorders>
+                              <w:tcMar>
+                                <w:top w:type="dxa" w:w="0"/>
+                                <w:left w:type="dxa" w:w="30"/>
+                                <w:bottom w:type="dxa" w:w="0"/>
+                                <w:right w:type="dxa" w:w="30"/>
+                              </w:tcMar>
+                            </w:tcPr>
+                            <w:p>
+                              <w:pPr>
+                                <w:spacing w:after="0" w:line="230"/>
+                                <w:jc w:val="center"/>
+                              </w:pPr>
+                              <w:r>
+                                <w:rPr>
+                                  <w:rFonts w:ascii="Consolas" w:cs="Consolas" w:eastAsia="Consolas" w:hAnsi="Consolas"/>
+                                  <w:b/>
+                                  <w:bCs/>
+                                  <w:color w:val="1A1A1A"/>
+                                  <w:sz w:val="26"/>
+                                  <w:szCs w:val="26"/>
+                                </w:rPr>
+                                <w:t xml:space="preserve">2</w:t>
+                              </w:r>
+                            </w:p>
+                          </w:tc>
+                        </w:tr>
+                      </w:tbl>
+                      <w:p/>
+                    </w:tc>
+                    <w:tc>
+                      <w:tcPr>
+                        <w:tcW w:type="dxa" w:w="520"/>
+                        <w:tcBorders>
+                          <w:top w:val="none" w:color="FFFFFF" w:sz="0"/>
+                          <w:left w:val="none" w:color="FFFFFF" w:sz="0"/>
+                          <w:bottom w:val="none" w:color="FFFFFF" w:sz="0"/>
+                          <w:right w:val="none" w:color="FFFFFF" w:sz="0"/>
+                        </w:tcBorders>
+                        <w:tcMar>
+                          <w:top w:type="dxa" w:w="30"/>
+                          <w:left w:type="dxa" w:w="10"/>
+                          <w:bottom w:type="dxa" w:w="30"/>
+                          <w:right w:type="dxa" w:w="10"/>
+                        </w:tcMar>
+                        <w:vAlign w:val="center"/>
+                      </w:tcPr>
+                      <w:p>
+                        <w:pPr>
+                          <w:jc w:val="center"/>
+                        </w:pPr>
+                        <w:r>
+                          <w:rPr>
+                            <w:rFonts w:ascii="Consolas" w:cs="Consolas" w:eastAsia="Consolas" w:hAnsi="Consolas"/>
+                            <w:b/>
+                            <w:bCs/>
+                            <w:color w:val="7A86A8"/>
+                            <w:sz w:val="26"/>
+                            <w:szCs w:val="26"/>
+                          </w:rPr>
+                          <w:t xml:space="preserve">+</w:t>
+                        </w:r>
+                      </w:p>
+                    </w:tc>
+                    <w:tc>
+                      <w:tcPr>
+                        <w:tcW w:type="dxa" w:w="700"/>
+                        <w:tcBorders>
+                          <w:top w:val="none" w:color="FFFFFF" w:sz="0"/>
+                          <w:left w:val="none" w:color="FFFFFF" w:sz="0"/>
+                          <w:bottom w:val="none" w:color="FFFFFF" w:sz="0"/>
+                          <w:right w:val="none" w:color="FFFFFF" w:sz="0"/>
+                        </w:tcBorders>
+                        <w:tcMar>
+                          <w:top w:type="dxa" w:w="30"/>
+                          <w:left w:type="dxa" w:w="20"/>
+                          <w:bottom w:type="dxa" w:w="30"/>
+                          <w:right w:type="dxa" w:w="20"/>
+                        </w:tcMar>
+                        <w:vAlign w:val="center"/>
+                      </w:tcPr>
+                      <w:tbl>
+                        <w:tblPr>
+                          <w:tblW w:type="dxa" w:w="600"/>
+                          <w:jc w:val="center"/>
+                          <w:tblBorders>
+                            <w:top w:val="single" w:color="auto" w:sz="4"/>
+                            <w:left w:val="single" w:color="auto" w:sz="4"/>
+                            <w:bottom w:val="single" w:color="auto" w:sz="4"/>
+                            <w:right w:val="single" w:color="auto" w:sz="4"/>
+                            <w:insideH w:val="none" w:color="FFFFFF" w:sz="0"/>
+                            <w:insideV w:val="single" w:color="auto" w:sz="4"/>
+                          </w:tblBorders>
+                        </w:tblPr>
+                        <w:tblGrid>
+                          <w:gridCol w:w="600"/>
+                        </w:tblGrid>
+                        <w:tr>
+                          <w:tc>
+                            <w:tcPr>
+                              <w:tcW w:type="dxa" w:w="520"/>
+                              <w:tcBorders>
+                                <w:top w:val="none" w:color="FFFFFF" w:sz="0"/>
+                                <w:left w:val="none" w:color="FFFFFF" w:sz="0"/>
+                                <w:bottom w:val="single" w:color="1A1A1A" w:sz="8"/>
+                                <w:right w:val="none" w:color="FFFFFF" w:sz="0"/>
+                              </w:tcBorders>
+                              <w:tcMar>
+                                <w:top w:type="dxa" w:w="0"/>
+                                <w:left w:type="dxa" w:w="30"/>
+                                <w:bottom w:type="dxa" w:w="0"/>
+                                <w:right w:type="dxa" w:w="30"/>
+                              </w:tcMar>
+                            </w:tcPr>
+                            <w:p>
+                              <w:pPr>
+                                <w:spacing w:after="0" w:line="230"/>
+                                <w:jc w:val="center"/>
+                              </w:pPr>
+                              <w:r>
+                                <w:rPr>
+                                  <w:rFonts w:ascii="Consolas" w:cs="Consolas" w:eastAsia="Consolas" w:hAnsi="Consolas"/>
+                                  <w:b/>
+                                  <w:bCs/>
+                                  <w:color w:val="1A1A1A"/>
+                                  <w:sz w:val="26"/>
+                                  <w:szCs w:val="26"/>
+                                </w:rPr>
+                                <w:t xml:space="preserve">1</w:t>
+                              </w:r>
+                            </w:p>
+                          </w:tc>
+                        </w:tr>
+                        <w:tr>
+                          <w:tc>
+                            <w:tcPr>
+                              <w:tcW w:type="dxa" w:w="520"/>
+                              <w:tcBorders>
+                                <w:top w:val="none" w:color="FFFFFF" w:sz="0"/>
+                                <w:left w:val="none" w:color="FFFFFF" w:sz="0"/>
+                                <w:bottom w:val="none" w:color="FFFFFF" w:sz="0"/>
+                                <w:right w:val="none" w:color="FFFFFF" w:sz="0"/>
+                              </w:tcBorders>
+                              <w:tcMar>
+                                <w:top w:type="dxa" w:w="0"/>
+                                <w:left w:type="dxa" w:w="30"/>
+                                <w:bottom w:type="dxa" w:w="0"/>
+                                <w:right w:type="dxa" w:w="30"/>
+                              </w:tcMar>
+                            </w:tcPr>
+                            <w:p>
+                              <w:pPr>
+                                <w:spacing w:after="0" w:line="230"/>
+                                <w:jc w:val="center"/>
+                              </w:pPr>
+                              <w:r>
+                                <w:rPr>
+                                  <w:rFonts w:ascii="Consolas" w:cs="Consolas" w:eastAsia="Consolas" w:hAnsi="Consolas"/>
+                                  <w:b/>
+                                  <w:bCs/>
+                                  <w:color w:val="1A1A1A"/>
+                                  <w:sz w:val="26"/>
+                                  <w:szCs w:val="26"/>
+                                </w:rPr>
+                                <w:t xml:space="preserve">3</w:t>
+                              </w:r>
+                            </w:p>
+                          </w:tc>
+                        </w:tr>
+                      </w:tbl>
+                      <w:p/>
+                    </w:tc>
+                    <w:tc>
+                      <w:tcPr>
+                        <w:tcW w:type="dxa" w:w="520"/>
+                        <w:tcBorders>
+                          <w:top w:val="none" w:color="FFFFFF" w:sz="0"/>
+                          <w:left w:val="none" w:color="FFFFFF" w:sz="0"/>
+                          <w:bottom w:val="none" w:color="FFFFFF" w:sz="0"/>
+                          <w:right w:val="none" w:color="FFFFFF" w:sz="0"/>
+                        </w:tcBorders>
+                        <w:tcMar>
+                          <w:top w:type="dxa" w:w="30"/>
+                          <w:left w:type="dxa" w:w="10"/>
+                          <w:bottom w:type="dxa" w:w="30"/>
+                          <w:right w:type="dxa" w:w="10"/>
+                        </w:tcMar>
+                        <w:vAlign w:val="center"/>
+                      </w:tcPr>
+                      <w:p>
+                        <w:pPr>
+                          <w:jc w:val="center"/>
+                        </w:pPr>
+                        <w:r>
+                          <w:rPr>
+                            <w:rFonts w:ascii="Consolas" w:cs="Consolas" w:eastAsia="Consolas" w:hAnsi="Consolas"/>
+                            <w:b/>
+                            <w:bCs/>
+                            <w:color w:val="7A86A8"/>
+                            <w:sz w:val="26"/>
+                            <w:szCs w:val="26"/>
+                          </w:rPr>
+                          <w:t xml:space="preserve">=</w:t>
+                        </w:r>
+                      </w:p>
+                    </w:tc>
+                    <w:tc>
+                      <w:tcPr>
+                        <w:tcW w:type="dxa" w:w="740"/>
+                        <w:tcBorders>
+                          <w:top w:val="none" w:color="FFFFFF" w:sz="0"/>
+                          <w:left w:val="none" w:color="FFFFFF" w:sz="0"/>
+                          <w:bottom w:val="none" w:color="FFFFFF" w:sz="0"/>
+                          <w:right w:val="none" w:color="FFFFFF" w:sz="0"/>
+                        </w:tcBorders>
+                        <w:tcMar>
+                          <w:top w:type="dxa" w:w="30"/>
+                          <w:left w:type="dxa" w:w="20"/>
+                          <w:bottom w:type="dxa" w:w="30"/>
+                          <w:right w:type="dxa" w:w="20"/>
+                        </w:tcMar>
+                        <w:vAlign w:val="center"/>
+                      </w:tcPr>
+                      <w:tbl>
+                        <w:tblPr>
+                          <w:tblW w:type="dxa" w:w="640"/>
+                          <w:jc w:val="center"/>
+                          <w:tblBorders>
+                            <w:top w:val="single" w:color="auto" w:sz="4"/>
+                            <w:left w:val="single" w:color="auto" w:sz="4"/>
+                            <w:bottom w:val="single" w:color="auto" w:sz="4"/>
+                            <w:right w:val="single" w:color="auto" w:sz="4"/>
+                            <w:insideH w:val="none" w:color="FFFFFF" w:sz="0"/>
+                            <w:insideV w:val="single" w:color="auto" w:sz="4"/>
+                          </w:tblBorders>
+                        </w:tblPr>
+                        <w:tblGrid>
+                          <w:gridCol w:w="640"/>
+                        </w:tblGrid>
+                        <w:tr>
+                          <w:tc>
+                            <w:tcPr>
+                              <w:tcW w:type="dxa" w:w="520"/>
+                              <w:tcBorders>
+                                <w:top w:val="none" w:color="FFFFFF" w:sz="0"/>
+                                <w:left w:val="none" w:color="FFFFFF" w:sz="0"/>
+                                <w:bottom w:val="single" w:color="1A1A1A" w:sz="8"/>
+                                <w:right w:val="none" w:color="FFFFFF" w:sz="0"/>
+                              </w:tcBorders>
+                              <w:tcMar>
+                                <w:top w:type="dxa" w:w="0"/>
+                                <w:left w:type="dxa" w:w="30"/>
+                                <w:bottom w:type="dxa" w:w="0"/>
+                                <w:right w:type="dxa" w:w="30"/>
+                              </w:tcMar>
+                            </w:tcPr>
+                            <w:p>
+                              <w:pPr>
+                                <w:spacing w:after="0" w:line="330"/>
+                                <w:jc w:val="center"/>
+                              </w:pPr>
+                              <w:r>
+                                <w:rPr>
+                                  <w:rFonts w:ascii="Consolas" w:cs="Consolas" w:eastAsia="Consolas" w:hAnsi="Consolas"/>
+                                  <w:b/>
+                                  <w:bCs/>
+                                  <w:color w:val="1A1A1A"/>
+                                  <w:sz w:val="26"/>
+                                  <w:szCs w:val="26"/>
+                                </w:rPr>
+                                <w:t xml:space="preserve">   </w:t>
+                              </w:r>
+                            </w:p>
+                          </w:tc>
+                        </w:tr>
+                        <w:tr>
+                          <w:tc>
+                            <w:tcPr>
+                              <w:tcW w:type="dxa" w:w="520"/>
+                              <w:tcBorders>
+                                <w:top w:val="none" w:color="FFFFFF" w:sz="0"/>
+                                <w:left w:val="none" w:color="FFFFFF" w:sz="0"/>
+                                <w:bottom w:val="none" w:color="FFFFFF" w:sz="0"/>
+                                <w:right w:val="none" w:color="FFFFFF" w:sz="0"/>
+                              </w:tcBorders>
+                              <w:tcMar>
+                                <w:top w:type="dxa" w:w="0"/>
+                                <w:left w:type="dxa" w:w="30"/>
+                                <w:bottom w:type="dxa" w:w="0"/>
+                                <w:right w:type="dxa" w:w="30"/>
+                              </w:tcMar>
+                            </w:tcPr>
+                            <w:p>
+                              <w:pPr>
+                                <w:spacing w:after="0" w:line="330"/>
+                                <w:jc w:val="center"/>
+                              </w:pPr>
+                              <w:r>
+                                <w:rPr>
+                                  <w:rFonts w:ascii="Consolas" w:cs="Consolas" w:eastAsia="Consolas" w:hAnsi="Consolas"/>
+                                  <w:b/>
+                                  <w:bCs/>
+                                  <w:color w:val="1A1A1A"/>
+                                  <w:sz w:val="26"/>
+                                  <w:szCs w:val="26"/>
+                                </w:rPr>
+                                <w:t xml:space="preserve">   </w:t>
+                              </w:r>
+                            </w:p>
+                          </w:tc>
+                        </w:tr>
+                      </w:tbl>
+                      <w:p/>
+                    </w:tc>
+                  </w:tr>
+                </w:tbl>
+                <w:p>
+                  <w:pPr>
+                    <w:spacing w:after="0" w:line="120" w:lineRule="exact"/>
+                  </w:pPr>
+                </w:p>
+              </w:tc>
+              <w:tc>
+                <w:tcPr>
+                  <w:tcW w:type="dxa" w:w="4510"/>
+                  <w:tcBorders>
+                    <w:top w:val="none" w:color="FFFFFF" w:sz="0"/>
+                    <w:left w:val="none" w:color="FFFFFF" w:sz="0"/>
+                    <w:bottom w:val="none" w:color="FFFFFF" w:sz="0"/>
+                    <w:right w:val="none" w:color="FFFFFF" w:sz="0"/>
+                  </w:tcBorders>
+                  <w:tcMar>
+                    <w:top w:type="dxa" w:w="30"/>
+                    <w:left w:type="dxa" w:w="0"/>
+                    <w:bottom w:type="dxa" w:w="60"/>
+                    <w:right w:type="dxa" w:w="0"/>
+                  </w:tcMar>
+                </w:tcPr>
+                <w:tbl>
+                  <w:tblPr>
+                    <w:tblW w:type="dxa" w:w="3180"/>
+                    <w:jc w:val="left"/>
+                    <w:tblBorders>
+                      <w:top w:val="single" w:color="auto" w:sz="4"/>
+                      <w:left w:val="single" w:color="auto" w:sz="4"/>
+                      <w:bottom w:val="single" w:color="auto" w:sz="4"/>
+                      <w:right w:val="single" w:color="auto" w:sz="4"/>
+                      <w:insideH w:val="single" w:color="auto" w:sz="4"/>
+                      <w:insideV w:val="single" w:color="auto" w:sz="4"/>
+                    </w:tblBorders>
+                  </w:tblPr>
+                  <w:tblGrid>
+                    <w:gridCol w:w="700"/>
+                    <w:gridCol w:w="520"/>
+                    <w:gridCol w:w="700"/>
+                    <w:gridCol w:w="520"/>
+                    <w:gridCol w:w="740"/>
+                  </w:tblGrid>
+                  <w:tr>
+                    <w:tc>
+                      <w:tcPr>
+                        <w:tcW w:type="dxa" w:w="700"/>
+                        <w:tcBorders>
+                          <w:top w:val="none" w:color="FFFFFF" w:sz="0"/>
+                          <w:left w:val="none" w:color="FFFFFF" w:sz="0"/>
+                          <w:bottom w:val="none" w:color="FFFFFF" w:sz="0"/>
+                          <w:right w:val="none" w:color="FFFFFF" w:sz="0"/>
+                        </w:tcBorders>
+                        <w:tcMar>
+                          <w:top w:type="dxa" w:w="30"/>
+                          <w:left w:type="dxa" w:w="20"/>
+                          <w:bottom w:type="dxa" w:w="30"/>
+                          <w:right w:type="dxa" w:w="20"/>
+                        </w:tcMar>
+                        <w:vAlign w:val="center"/>
+                      </w:tcPr>
+                      <w:tbl>
+                        <w:tblPr>
+                          <w:tblW w:type="dxa" w:w="600"/>
+                          <w:jc w:val="center"/>
+                          <w:tblBorders>
+                            <w:top w:val="single" w:color="auto" w:sz="4"/>
+                            <w:left w:val="single" w:color="auto" w:sz="4"/>
+                            <w:bottom w:val="single" w:color="auto" w:sz="4"/>
+                            <w:right w:val="single" w:color="auto" w:sz="4"/>
+                            <w:insideH w:val="none" w:color="FFFFFF" w:sz="0"/>
+                            <w:insideV w:val="single" w:color="auto" w:sz="4"/>
+                          </w:tblBorders>
+                        </w:tblPr>
+                        <w:tblGrid>
+                          <w:gridCol w:w="600"/>
+                        </w:tblGrid>
+                        <w:tr>
+                          <w:tc>
+                            <w:tcPr>
+                              <w:tcW w:type="dxa" w:w="520"/>
+                              <w:tcBorders>
+                                <w:top w:val="none" w:color="FFFFFF" w:sz="0"/>
+                                <w:left w:val="none" w:color="FFFFFF" w:sz="0"/>
+                                <w:bottom w:val="single" w:color="1A1A1A" w:sz="8"/>
+                                <w:right w:val="none" w:color="FFFFFF" w:sz="0"/>
+                              </w:tcBorders>
+                              <w:tcMar>
+                                <w:top w:type="dxa" w:w="0"/>
+                                <w:left w:type="dxa" w:w="30"/>
+                                <w:bottom w:type="dxa" w:w="0"/>
+                                <w:right w:type="dxa" w:w="30"/>
+                              </w:tcMar>
+                            </w:tcPr>
+                            <w:p>
+                              <w:pPr>
+                                <w:spacing w:after="0" w:line="230"/>
+                                <w:jc w:val="center"/>
+                              </w:pPr>
+                              <w:r>
+                                <w:rPr>
+                                  <w:rFonts w:ascii="Consolas" w:cs="Consolas" w:eastAsia="Consolas" w:hAnsi="Consolas"/>
+                                  <w:b/>
+                                  <w:bCs/>
+                                  <w:color w:val="1A1A1A"/>
+                                  <w:sz w:val="26"/>
+                                  <w:szCs w:val="26"/>
+                                </w:rPr>
+                                <w:t xml:space="preserve">2</w:t>
+                              </w:r>
+                            </w:p>
+                          </w:tc>
+                        </w:tr>
+                        <w:tr>
+                          <w:tc>
+                            <w:tcPr>
+                              <w:tcW w:type="dxa" w:w="520"/>
+                              <w:tcBorders>
+                                <w:top w:val="none" w:color="FFFFFF" w:sz="0"/>
+                                <w:left w:val="none" w:color="FFFFFF" w:sz="0"/>
+                                <w:bottom w:val="none" w:color="FFFFFF" w:sz="0"/>
+                                <w:right w:val="none" w:color="FFFFFF" w:sz="0"/>
+                              </w:tcBorders>
+                              <w:tcMar>
+                                <w:top w:type="dxa" w:w="0"/>
+                                <w:left w:type="dxa" w:w="30"/>
+                                <w:bottom w:type="dxa" w:w="0"/>
+                                <w:right w:type="dxa" w:w="30"/>
+                              </w:tcMar>
+                            </w:tcPr>
+                            <w:p>
+                              <w:pPr>
+                                <w:spacing w:after="0" w:line="230"/>
+                                <w:jc w:val="center"/>
+                              </w:pPr>
+                              <w:r>
+                                <w:rPr>
+                                  <w:rFonts w:ascii="Consolas" w:cs="Consolas" w:eastAsia="Consolas" w:hAnsi="Consolas"/>
+                                  <w:b/>
+                                  <w:bCs/>
+                                  <w:color w:val="1A1A1A"/>
+                                  <w:sz w:val="26"/>
+                                  <w:szCs w:val="26"/>
+                                </w:rPr>
+                                <w:t xml:space="preserve">3</w:t>
+                              </w:r>
+                            </w:p>
+                          </w:tc>
+                        </w:tr>
+                      </w:tbl>
+                      <w:p/>
+                    </w:tc>
+                    <w:tc>
+                      <w:tcPr>
+                        <w:tcW w:type="dxa" w:w="520"/>
+                        <w:tcBorders>
+                          <w:top w:val="none" w:color="FFFFFF" w:sz="0"/>
+                          <w:left w:val="none" w:color="FFFFFF" w:sz="0"/>
+                          <w:bottom w:val="none" w:color="FFFFFF" w:sz="0"/>
+                          <w:right w:val="none" w:color="FFFFFF" w:sz="0"/>
+                        </w:tcBorders>
+                        <w:tcMar>
+                          <w:top w:type="dxa" w:w="30"/>
+                          <w:left w:type="dxa" w:w="10"/>
+                          <w:bottom w:type="dxa" w:w="30"/>
+                          <w:right w:type="dxa" w:w="10"/>
+                        </w:tcMar>
+                        <w:vAlign w:val="center"/>
+                      </w:tcPr>
+                      <w:p>
+                        <w:pPr>
+                          <w:jc w:val="center"/>
+                        </w:pPr>
+                        <w:r>
+                          <w:rPr>
+                            <w:rFonts w:ascii="Consolas" w:cs="Consolas" w:eastAsia="Consolas" w:hAnsi="Consolas"/>
+                            <w:b/>
+                            <w:bCs/>
+                            <w:color w:val="7A86A8"/>
+                            <w:sz w:val="26"/>
+                            <w:szCs w:val="26"/>
+                          </w:rPr>
+                          <w:t xml:space="preserve">×</w:t>
+                        </w:r>
+                      </w:p>
+                    </w:tc>
+                    <w:tc>
+                      <w:tcPr>
+                        <w:tcW w:type="dxa" w:w="700"/>
+                        <w:tcBorders>
+                          <w:top w:val="none" w:color="FFFFFF" w:sz="0"/>
+                          <w:left w:val="none" w:color="FFFFFF" w:sz="0"/>
+                          <w:bottom w:val="none" w:color="FFFFFF" w:sz="0"/>
+                          <w:right w:val="none" w:color="FFFFFF" w:sz="0"/>
+                        </w:tcBorders>
+                        <w:tcMar>
+                          <w:top w:type="dxa" w:w="30"/>
+                          <w:left w:type="dxa" w:w="20"/>
+                          <w:bottom w:type="dxa" w:w="30"/>
+                          <w:right w:type="dxa" w:w="20"/>
+                        </w:tcMar>
+                        <w:vAlign w:val="center"/>
+                      </w:tcPr>
+                      <w:tbl>
+                        <w:tblPr>
+                          <w:tblW w:type="dxa" w:w="600"/>
+                          <w:jc w:val="center"/>
+                          <w:tblBorders>
+                            <w:top w:val="single" w:color="auto" w:sz="4"/>
+                            <w:left w:val="single" w:color="auto" w:sz="4"/>
+                            <w:bottom w:val="single" w:color="auto" w:sz="4"/>
+                            <w:right w:val="single" w:color="auto" w:sz="4"/>
+                            <w:insideH w:val="none" w:color="FFFFFF" w:sz="0"/>
+                            <w:insideV w:val="single" w:color="auto" w:sz="4"/>
+                          </w:tblBorders>
+                        </w:tblPr>
+                        <w:tblGrid>
+                          <w:gridCol w:w="600"/>
+                        </w:tblGrid>
+                        <w:tr>
+                          <w:tc>
+                            <w:tcPr>
+                              <w:tcW w:type="dxa" w:w="520"/>
+                              <w:tcBorders>
+                                <w:top w:val="none" w:color="FFFFFF" w:sz="0"/>
+                                <w:left w:val="none" w:color="FFFFFF" w:sz="0"/>
+                                <w:bottom w:val="single" w:color="1A1A1A" w:sz="8"/>
+                                <w:right w:val="none" w:color="FFFFFF" w:sz="0"/>
+                              </w:tcBorders>
+                              <w:tcMar>
+                                <w:top w:type="dxa" w:w="0"/>
+                                <w:left w:type="dxa" w:w="30"/>
+                                <w:bottom w:type="dxa" w:w="0"/>
+                                <w:right w:type="dxa" w:w="30"/>
+                              </w:tcMar>
+                            </w:tcPr>
+                            <w:p>
+                              <w:pPr>
+                                <w:spacing w:after="0" w:line="230"/>
+                                <w:jc w:val="center"/>
+                              </w:pPr>
+                              <w:r>
+                                <w:rPr>
+                                  <w:rFonts w:ascii="Consolas" w:cs="Consolas" w:eastAsia="Consolas" w:hAnsi="Consolas"/>
+                                  <w:b/>
+                                  <w:bCs/>
+                                  <w:color w:val="1A1A1A"/>
+                                  <w:sz w:val="26"/>
+                                  <w:szCs w:val="26"/>
+                                </w:rPr>
+                                <w:t xml:space="preserve">3</w:t>
+                              </w:r>
+                            </w:p>
+                          </w:tc>
+                        </w:tr>
+                        <w:tr>
+                          <w:tc>
+                            <w:tcPr>
+                              <w:tcW w:type="dxa" w:w="520"/>
+                              <w:tcBorders>
+                                <w:top w:val="none" w:color="FFFFFF" w:sz="0"/>
+                                <w:left w:val="none" w:color="FFFFFF" w:sz="0"/>
+                                <w:bottom w:val="none" w:color="FFFFFF" w:sz="0"/>
+                                <w:right w:val="none" w:color="FFFFFF" w:sz="0"/>
+                              </w:tcBorders>
+                              <w:tcMar>
+                                <w:top w:type="dxa" w:w="0"/>
+                                <w:left w:type="dxa" w:w="30"/>
+                                <w:bottom w:type="dxa" w:w="0"/>
+                                <w:right w:type="dxa" w:w="30"/>
+                              </w:tcMar>
+                            </w:tcPr>
+                            <w:p>
+                              <w:pPr>
+                                <w:spacing w:after="0" w:line="230"/>
+                                <w:jc w:val="center"/>
+                              </w:pPr>
+                              <w:r>
+                                <w:rPr>
+                                  <w:rFonts w:ascii="Consolas" w:cs="Consolas" w:eastAsia="Consolas" w:hAnsi="Consolas"/>
+                                  <w:b/>
+                                  <w:bCs/>
+                                  <w:color w:val="1A1A1A"/>
+                                  <w:sz w:val="26"/>
+                                  <w:szCs w:val="26"/>
+                                </w:rPr>
+                                <w:t xml:space="preserve">4</w:t>
+                              </w:r>
+                            </w:p>
+                          </w:tc>
+                        </w:tr>
+                      </w:tbl>
+                      <w:p/>
+                    </w:tc>
+                    <w:tc>
+                      <w:tcPr>
+                        <w:tcW w:type="dxa" w:w="520"/>
+                        <w:tcBorders>
+                          <w:top w:val="none" w:color="FFFFFF" w:sz="0"/>
+                          <w:left w:val="none" w:color="FFFFFF" w:sz="0"/>
+                          <w:bottom w:val="none" w:color="FFFFFF" w:sz="0"/>
+                          <w:right w:val="none" w:color="FFFFFF" w:sz="0"/>
+                        </w:tcBorders>
+                        <w:tcMar>
+                          <w:top w:type="dxa" w:w="30"/>
+                          <w:left w:type="dxa" w:w="10"/>
+                          <w:bottom w:type="dxa" w:w="30"/>
+                          <w:right w:type="dxa" w:w="10"/>
+                        </w:tcMar>
+                        <w:vAlign w:val="center"/>
+                      </w:tcPr>
+                      <w:p>
+                        <w:pPr>
+                          <w:jc w:val="center"/>
+                        </w:pPr>
+                        <w:r>
+                          <w:rPr>
+                            <w:rFonts w:ascii="Consolas" w:cs="Consolas" w:eastAsia="Consolas" w:hAnsi="Consolas"/>
+                            <w:b/>
+                            <w:bCs/>
+                            <w:color w:val="7A86A8"/>
+                            <w:sz w:val="26"/>
+                            <w:szCs w:val="26"/>
+                          </w:rPr>
+                          <w:t xml:space="preserve">=</w:t>
+                        </w:r>
+                      </w:p>
+                    </w:tc>
+                    <w:tc>
+                      <w:tcPr>
+                        <w:tcW w:type="dxa" w:w="740"/>
+                        <w:tcBorders>
+                          <w:top w:val="none" w:color="FFFFFF" w:sz="0"/>
+                          <w:left w:val="none" w:color="FFFFFF" w:sz="0"/>
+                          <w:bottom w:val="none" w:color="FFFFFF" w:sz="0"/>
+                          <w:right w:val="none" w:color="FFFFFF" w:sz="0"/>
+                        </w:tcBorders>
+                        <w:tcMar>
+                          <w:top w:type="dxa" w:w="30"/>
+                          <w:left w:type="dxa" w:w="20"/>
+                          <w:bottom w:type="dxa" w:w="30"/>
+                          <w:right w:type="dxa" w:w="20"/>
+                        </w:tcMar>
+                        <w:vAlign w:val="center"/>
+                      </w:tcPr>
+                      <w:tbl>
+                        <w:tblPr>
+                          <w:tblW w:type="dxa" w:w="640"/>
+                          <w:jc w:val="center"/>
+                          <w:tblBorders>
+                            <w:top w:val="single" w:color="auto" w:sz="4"/>
+                            <w:left w:val="single" w:color="auto" w:sz="4"/>
+                            <w:bottom w:val="single" w:color="auto" w:sz="4"/>
+                            <w:right w:val="single" w:color="auto" w:sz="4"/>
+                            <w:insideH w:val="none" w:color="FFFFFF" w:sz="0"/>
+                            <w:insideV w:val="single" w:color="auto" w:sz="4"/>
+                          </w:tblBorders>
+                        </w:tblPr>
+                        <w:tblGrid>
+                          <w:gridCol w:w="640"/>
+                        </w:tblGrid>
+                        <w:tr>
+                          <w:tc>
+                            <w:tcPr>
+                              <w:tcW w:type="dxa" w:w="520"/>
+                              <w:tcBorders>
+                                <w:top w:val="none" w:color="FFFFFF" w:sz="0"/>
+                                <w:left w:val="none" w:color="FFFFFF" w:sz="0"/>
+                                <w:bottom w:val="single" w:color="1A1A1A" w:sz="8"/>
+                                <w:right w:val="none" w:color="FFFFFF" w:sz="0"/>
+                              </w:tcBorders>
+                              <w:tcMar>
+                                <w:top w:type="dxa" w:w="0"/>
+                                <w:left w:type="dxa" w:w="30"/>
+                                <w:bottom w:type="dxa" w:w="0"/>
+                                <w:right w:type="dxa" w:w="30"/>
+                              </w:tcMar>
+                            </w:tcPr>
+                            <w:p>
+                              <w:pPr>
+                                <w:spacing w:after="0" w:line="330"/>
+                                <w:jc w:val="center"/>
+                              </w:pPr>
+                              <w:r>
+                                <w:rPr>
+                                  <w:rFonts w:ascii="Consolas" w:cs="Consolas" w:eastAsia="Consolas" w:hAnsi="Consolas"/>
+                                  <w:b/>
+                                  <w:bCs/>
+                                  <w:color w:val="1A1A1A"/>
+                                  <w:sz w:val="26"/>
+                                  <w:szCs w:val="26"/>
+                                </w:rPr>
+                                <w:t xml:space="preserve">   </w:t>
+                              </w:r>
+                            </w:p>
+                          </w:tc>
+                        </w:tr>
+                        <w:tr>
+                          <w:tc>
+                            <w:tcPr>
+                              <w:tcW w:type="dxa" w:w="520"/>
+                              <w:tcBorders>
+                                <w:top w:val="none" w:color="FFFFFF" w:sz="0"/>
+                                <w:left w:val="none" w:color="FFFFFF" w:sz="0"/>
+                                <w:bottom w:val="none" w:color="FFFFFF" w:sz="0"/>
+                                <w:right w:val="none" w:color="FFFFFF" w:sz="0"/>
+                              </w:tcBorders>
+                              <w:tcMar>
+                                <w:top w:type="dxa" w:w="0"/>
+                                <w:left w:type="dxa" w:w="30"/>
+                                <w:bottom w:type="dxa" w:w="0"/>
+                                <w:right w:type="dxa" w:w="30"/>
+                              </w:tcMar>
+                            </w:tcPr>
+                            <w:p>
+                              <w:pPr>
+                                <w:spacing w:after="0" w:line="330"/>
+                                <w:jc w:val="center"/>
+                              </w:pPr>
+                              <w:r>
+                                <w:rPr>
+                                  <w:rFonts w:ascii="Consolas" w:cs="Consolas" w:eastAsia="Consolas" w:hAnsi="Consolas"/>
+                                  <w:b/>
+                                  <w:bCs/>
+                                  <w:color w:val="1A1A1A"/>
+                                  <w:sz w:val="26"/>
+                                  <w:szCs w:val="26"/>
+                                </w:rPr>
+                                <w:t xml:space="preserve">   </w:t>
+                              </w:r>
+                            </w:p>
+                          </w:tc>
+                        </w:tr>
+                      </w:tbl>
+                      <w:p/>
+                    </w:tc>
+                  </w:tr>
+                </w:tbl>
+                <w:p>
+                  <w:pPr>
+                    <w:spacing w:after="0" w:line="120" w:lineRule="exact"/>
+                  </w:pPr>
+                </w:p>
+              </w:tc>
+            </w:tr>
+            <w:tr>
+              <w:tc>
+                <w:tcPr>
+                  <w:tcW w:type="dxa" w:w="4510"/>
+                  <w:tcBorders>
+                    <w:top w:val="none" w:color="FFFFFF" w:sz="0"/>
+                    <w:left w:val="none" w:color="FFFFFF" w:sz="0"/>
+                    <w:bottom w:val="none" w:color="FFFFFF" w:sz="0"/>
+                    <w:right w:val="none" w:color="FFFFFF" w:sz="0"/>
+                  </w:tcBorders>
+                  <w:tcMar>
+                    <w:top w:type="dxa" w:w="30"/>
+                    <w:left w:type="dxa" w:w="0"/>
+                    <w:bottom w:type="dxa" w:w="60"/>
+                    <w:right w:type="dxa" w:w="0"/>
+                  </w:tcMar>
+                </w:tcPr>
+                <w:tbl>
+                  <w:tblPr>
+                    <w:tblW w:type="dxa" w:w="3180"/>
+                    <w:jc w:val="left"/>
+                    <w:tblBorders>
+                      <w:top w:val="single" w:color="auto" w:sz="4"/>
+                      <w:left w:val="single" w:color="auto" w:sz="4"/>
+                      <w:bottom w:val="single" w:color="auto" w:sz="4"/>
+                      <w:right w:val="single" w:color="auto" w:sz="4"/>
+                      <w:insideH w:val="single" w:color="auto" w:sz="4"/>
+                      <w:insideV w:val="single" w:color="auto" w:sz="4"/>
+                    </w:tblBorders>
+                  </w:tblPr>
+                  <w:tblGrid>
+                    <w:gridCol w:w="700"/>
+                    <w:gridCol w:w="520"/>
+                    <w:gridCol w:w="700"/>
+                    <w:gridCol w:w="520"/>
+                    <w:gridCol w:w="740"/>
+                  </w:tblGrid>
+                  <w:tr>
+                    <w:tc>
+                      <w:tcPr>
+                        <w:tcW w:type="dxa" w:w="700"/>
+                        <w:tcBorders>
+                          <w:top w:val="none" w:color="FFFFFF" w:sz="0"/>
+                          <w:left w:val="none" w:color="FFFFFF" w:sz="0"/>
+                          <w:bottom w:val="none" w:color="FFFFFF" w:sz="0"/>
+                          <w:right w:val="none" w:color="FFFFFF" w:sz="0"/>
+                        </w:tcBorders>
+                        <w:tcMar>
+                          <w:top w:type="dxa" w:w="30"/>
+                          <w:left w:type="dxa" w:w="20"/>
+                          <w:bottom w:type="dxa" w:w="30"/>
+                          <w:right w:type="dxa" w:w="20"/>
+                        </w:tcMar>
+                        <w:vAlign w:val="center"/>
+                      </w:tcPr>
+                      <w:tbl>
+                        <w:tblPr>
+                          <w:tblW w:type="dxa" w:w="600"/>
+                          <w:jc w:val="center"/>
+                          <w:tblBorders>
+                            <w:top w:val="single" w:color="auto" w:sz="4"/>
+                            <w:left w:val="single" w:color="auto" w:sz="4"/>
+                            <w:bottom w:val="single" w:color="auto" w:sz="4"/>
+                            <w:right w:val="single" w:color="auto" w:sz="4"/>
+                            <w:insideH w:val="none" w:color="FFFFFF" w:sz="0"/>
+                            <w:insideV w:val="single" w:color="auto" w:sz="4"/>
+                          </w:tblBorders>
+                        </w:tblPr>
+                        <w:tblGrid>
+                          <w:gridCol w:w="600"/>
+                        </w:tblGrid>
+                        <w:tr>
+                          <w:tc>
+                            <w:tcPr>
+                              <w:tcW w:type="dxa" w:w="520"/>
+                              <w:tcBorders>
+                                <w:top w:val="none" w:color="FFFFFF" w:sz="0"/>
+                                <w:left w:val="none" w:color="FFFFFF" w:sz="0"/>
+                                <w:bottom w:val="single" w:color="1A1A1A" w:sz="8"/>
+                                <w:right w:val="none" w:color="FFFFFF" w:sz="0"/>
+                              </w:tcBorders>
+                              <w:tcMar>
+                                <w:top w:type="dxa" w:w="0"/>
+                                <w:left w:type="dxa" w:w="30"/>
+                                <w:bottom w:type="dxa" w:w="0"/>
+                                <w:right w:type="dxa" w:w="30"/>
+                              </w:tcMar>
+                            </w:tcPr>
+                            <w:p>
+                              <w:pPr>
+                                <w:spacing w:after="0" w:line="230"/>
+                                <w:jc w:val="center"/>
+                              </w:pPr>
+                              <w:r>
+                                <w:rPr>
+                                  <w:rFonts w:ascii="Consolas" w:cs="Consolas" w:eastAsia="Consolas" w:hAnsi="Consolas"/>
+                                  <w:b/>
+                                  <w:bCs/>
+                                  <w:color w:val="1A1A1A"/>
+                                  <w:sz w:val="26"/>
+                                  <w:szCs w:val="26"/>
+                                </w:rPr>
+                                <w:t xml:space="preserve">5</w:t>
+                              </w:r>
+                            </w:p>
+                          </w:tc>
+                        </w:tr>
+                        <w:tr>
+                          <w:tc>
+                            <w:tcPr>
+                              <w:tcW w:type="dxa" w:w="520"/>
+                              <w:tcBorders>
+                                <w:top w:val="none" w:color="FFFFFF" w:sz="0"/>
+                                <w:left w:val="none" w:color="FFFFFF" w:sz="0"/>
+                                <w:bottom w:val="none" w:color="FFFFFF" w:sz="0"/>
+                                <w:right w:val="none" w:color="FFFFFF" w:sz="0"/>
+                              </w:tcBorders>
+                              <w:tcMar>
+                                <w:top w:type="dxa" w:w="0"/>
+                                <w:left w:type="dxa" w:w="30"/>
+                                <w:bottom w:type="dxa" w:w="0"/>
+                                <w:right w:type="dxa" w:w="30"/>
+                              </w:tcMar>
+                            </w:tcPr>
+                            <w:p>
+                              <w:pPr>
+                                <w:spacing w:after="0" w:line="230"/>
+                                <w:jc w:val="center"/>
+                              </w:pPr>
+                              <w:r>
+                                <w:rPr>
+                                  <w:rFonts w:ascii="Consolas" w:cs="Consolas" w:eastAsia="Consolas" w:hAnsi="Consolas"/>
+                                  <w:b/>
+                                  <w:bCs/>
+                                  <w:color w:val="1A1A1A"/>
+                                  <w:sz w:val="26"/>
+                                  <w:szCs w:val="26"/>
+                                </w:rPr>
+                                <w:t xml:space="preserve">6</w:t>
+                              </w:r>
+                            </w:p>
+                          </w:tc>
+                        </w:tr>
+                      </w:tbl>
+                      <w:p/>
+                    </w:tc>
+                    <w:tc>
+                      <w:tcPr>
+                        <w:tcW w:type="dxa" w:w="520"/>
+                        <w:tcBorders>
+                          <w:top w:val="none" w:color="FFFFFF" w:sz="0"/>
+                          <w:left w:val="none" w:color="FFFFFF" w:sz="0"/>
+                          <w:bottom w:val="none" w:color="FFFFFF" w:sz="0"/>
+                          <w:right w:val="none" w:color="FFFFFF" w:sz="0"/>
+                        </w:tcBorders>
+                        <w:tcMar>
+                          <w:top w:type="dxa" w:w="30"/>
+                          <w:left w:type="dxa" w:w="10"/>
+                          <w:bottom w:type="dxa" w:w="30"/>
+                          <w:right w:type="dxa" w:w="10"/>
+                        </w:tcMar>
+                        <w:vAlign w:val="center"/>
+                      </w:tcPr>
+                      <w:p>
+                        <w:pPr>
+                          <w:jc w:val="center"/>
+                        </w:pPr>
+                        <w:r>
+                          <w:rPr>
+                            <w:rFonts w:ascii="Consolas" w:cs="Consolas" w:eastAsia="Consolas" w:hAnsi="Consolas"/>
+                            <w:b/>
+                            <w:bCs/>
+                            <w:color w:val="7A86A8"/>
+                            <w:sz w:val="26"/>
+                            <w:szCs w:val="26"/>
+                          </w:rPr>
+                          <w:t xml:space="preserve">−</w:t>
+                        </w:r>
+                      </w:p>
+                    </w:tc>
+                    <w:tc>
+                      <w:tcPr>
+                        <w:tcW w:type="dxa" w:w="700"/>
+                        <w:tcBorders>
+                          <w:top w:val="none" w:color="FFFFFF" w:sz="0"/>
+                          <w:left w:val="none" w:color="FFFFFF" w:sz="0"/>
+                          <w:bottom w:val="none" w:color="FFFFFF" w:sz="0"/>
+                          <w:right w:val="none" w:color="FFFFFF" w:sz="0"/>
+                        </w:tcBorders>
+                        <w:tcMar>
+                          <w:top w:type="dxa" w:w="30"/>
+                          <w:left w:type="dxa" w:w="20"/>
+                          <w:bottom w:type="dxa" w:w="30"/>
+                          <w:right w:type="dxa" w:w="20"/>
+                        </w:tcMar>
+                        <w:vAlign w:val="center"/>
+                      </w:tcPr>
+                      <w:tbl>
+                        <w:tblPr>
+                          <w:tblW w:type="dxa" w:w="600"/>
+                          <w:jc w:val="center"/>
+                          <w:tblBorders>
+                            <w:top w:val="single" w:color="auto" w:sz="4"/>
+                            <w:left w:val="single" w:color="auto" w:sz="4"/>
+                            <w:bottom w:val="single" w:color="auto" w:sz="4"/>
+                            <w:right w:val="single" w:color="auto" w:sz="4"/>
+                            <w:insideH w:val="none" w:color="FFFFFF" w:sz="0"/>
+                            <w:insideV w:val="single" w:color="auto" w:sz="4"/>
+                          </w:tblBorders>
+                        </w:tblPr>
+                        <w:tblGrid>
+                          <w:gridCol w:w="600"/>
+                        </w:tblGrid>
+                        <w:tr>
+                          <w:tc>
+                            <w:tcPr>
+                              <w:tcW w:type="dxa" w:w="520"/>
+                              <w:tcBorders>
+                                <w:top w:val="none" w:color="FFFFFF" w:sz="0"/>
+                                <w:left w:val="none" w:color="FFFFFF" w:sz="0"/>
+                                <w:bottom w:val="single" w:color="1A1A1A" w:sz="8"/>
+                                <w:right w:val="none" w:color="FFFFFF" w:sz="0"/>
+                              </w:tcBorders>
+                              <w:tcMar>
+                                <w:top w:type="dxa" w:w="0"/>
+                                <w:left w:type="dxa" w:w="30"/>
+                                <w:bottom w:type="dxa" w:w="0"/>
+                                <w:right w:type="dxa" w:w="30"/>
+                              </w:tcMar>
+                            </w:tcPr>
+                            <w:p>
+                              <w:pPr>
+                                <w:spacing w:after="0" w:line="230"/>
+                                <w:jc w:val="center"/>
+                              </w:pPr>
+                              <w:r>
+                                <w:rPr>
+                                  <w:rFonts w:ascii="Consolas" w:cs="Consolas" w:eastAsia="Consolas" w:hAnsi="Consolas"/>
+                                  <w:b/>
+                                  <w:bCs/>
+                                  <w:color w:val="1A1A1A"/>
+                                  <w:sz w:val="26"/>
+                                  <w:szCs w:val="26"/>
+                                </w:rPr>
+                                <w:t xml:space="preserve">1</w:t>
+                              </w:r>
+                            </w:p>
+                          </w:tc>
+                        </w:tr>
+                        <w:tr>
+                          <w:tc>
+                            <w:tcPr>
+                              <w:tcW w:type="dxa" w:w="520"/>
+                              <w:tcBorders>
+                                <w:top w:val="none" w:color="FFFFFF" w:sz="0"/>
+                                <w:left w:val="none" w:color="FFFFFF" w:sz="0"/>
+                                <w:bottom w:val="none" w:color="FFFFFF" w:sz="0"/>
+                                <w:right w:val="none" w:color="FFFFFF" w:sz="0"/>
+                              </w:tcBorders>
+                              <w:tcMar>
+                                <w:top w:type="dxa" w:w="0"/>
+                                <w:left w:type="dxa" w:w="30"/>
+                                <w:bottom w:type="dxa" w:w="0"/>
+                                <w:right w:type="dxa" w:w="30"/>
+                              </w:tcMar>
+                            </w:tcPr>
+                            <w:p>
+                              <w:pPr>
+                                <w:spacing w:after="0" w:line="230"/>
+                                <w:jc w:val="center"/>
+                              </w:pPr>
+                              <w:r>
+                                <w:rPr>
+                                  <w:rFonts w:ascii="Consolas" w:cs="Consolas" w:eastAsia="Consolas" w:hAnsi="Consolas"/>
+                                  <w:b/>
+                                  <w:bCs/>
+                                  <w:color w:val="1A1A1A"/>
+                                  <w:sz w:val="26"/>
+                                  <w:szCs w:val="26"/>
+                                </w:rPr>
+                                <w:t xml:space="preserve">4</w:t>
+                              </w:r>
+                            </w:p>
+                          </w:tc>
+                        </w:tr>
+                      </w:tbl>
+                      <w:p/>
+                    </w:tc>
+                    <w:tc>
+                      <w:tcPr>
+                        <w:tcW w:type="dxa" w:w="520"/>
+                        <w:tcBorders>
+                          <w:top w:val="none" w:color="FFFFFF" w:sz="0"/>
+                          <w:left w:val="none" w:color="FFFFFF" w:sz="0"/>
+                          <w:bottom w:val="none" w:color="FFFFFF" w:sz="0"/>
+                          <w:right w:val="none" w:color="FFFFFF" w:sz="0"/>
+                        </w:tcBorders>
+                        <w:tcMar>
+                          <w:top w:type="dxa" w:w="30"/>
+                          <w:left w:type="dxa" w:w="10"/>
+                          <w:bottom w:type="dxa" w:w="30"/>
+                          <w:right w:type="dxa" w:w="10"/>
+                        </w:tcMar>
+                        <w:vAlign w:val="center"/>
+                      </w:tcPr>
+                      <w:p>
+                        <w:pPr>
+                          <w:jc w:val="center"/>
+                        </w:pPr>
+                        <w:r>
+                          <w:rPr>
+                            <w:rFonts w:ascii="Consolas" w:cs="Consolas" w:eastAsia="Consolas" w:hAnsi="Consolas"/>
+                            <w:b/>
+                            <w:bCs/>
+                            <w:color w:val="7A86A8"/>
+                            <w:sz w:val="26"/>
+                            <w:szCs w:val="26"/>
+                          </w:rPr>
+                          <w:t xml:space="preserve">=</w:t>
+                        </w:r>
+                      </w:p>
+                    </w:tc>
+                    <w:tc>
+                      <w:tcPr>
+                        <w:tcW w:type="dxa" w:w="740"/>
+                        <w:tcBorders>
+                          <w:top w:val="none" w:color="FFFFFF" w:sz="0"/>
+                          <w:left w:val="none" w:color="FFFFFF" w:sz="0"/>
+                          <w:bottom w:val="none" w:color="FFFFFF" w:sz="0"/>
+                          <w:right w:val="none" w:color="FFFFFF" w:sz="0"/>
+                        </w:tcBorders>
+                        <w:tcMar>
+                          <w:top w:type="dxa" w:w="30"/>
+                          <w:left w:type="dxa" w:w="20"/>
+                          <w:bottom w:type="dxa" w:w="30"/>
+                          <w:right w:type="dxa" w:w="20"/>
+                        </w:tcMar>
+                        <w:vAlign w:val="center"/>
+                      </w:tcPr>
+                      <w:tbl>
+                        <w:tblPr>
+                          <w:tblW w:type="dxa" w:w="640"/>
+                          <w:jc w:val="center"/>
+                          <w:tblBorders>
+                            <w:top w:val="single" w:color="auto" w:sz="4"/>
+                            <w:left w:val="single" w:color="auto" w:sz="4"/>
+                            <w:bottom w:val="single" w:color="auto" w:sz="4"/>
+                            <w:right w:val="single" w:color="auto" w:sz="4"/>
+                            <w:insideH w:val="none" w:color="FFFFFF" w:sz="0"/>
+                            <w:insideV w:val="single" w:color="auto" w:sz="4"/>
+                          </w:tblBorders>
+                        </w:tblPr>
+                        <w:tblGrid>
+                          <w:gridCol w:w="640"/>
+                        </w:tblGrid>
+                        <w:tr>
+                          <w:tc>
+                            <w:tcPr>
+                              <w:tcW w:type="dxa" w:w="520"/>
+                              <w:tcBorders>
+                                <w:top w:val="none" w:color="FFFFFF" w:sz="0"/>
+                                <w:left w:val="none" w:color="FFFFFF" w:sz="0"/>
+                                <w:bottom w:val="single" w:color="1A1A1A" w:sz="8"/>
+                                <w:right w:val="none" w:color="FFFFFF" w:sz="0"/>
+                              </w:tcBorders>
+                              <w:tcMar>
+                                <w:top w:type="dxa" w:w="0"/>
+                                <w:left w:type="dxa" w:w="30"/>
+                                <w:bottom w:type="dxa" w:w="0"/>
+                                <w:right w:type="dxa" w:w="30"/>
+                              </w:tcMar>
+                            </w:tcPr>
+                            <w:p>
+                              <w:pPr>
+                                <w:spacing w:after="0" w:line="330"/>
+                                <w:jc w:val="center"/>
+                              </w:pPr>
+                              <w:r>
+                                <w:rPr>
+                                  <w:rFonts w:ascii="Consolas" w:cs="Consolas" w:eastAsia="Consolas" w:hAnsi="Consolas"/>
+                                  <w:b/>
+                                  <w:bCs/>
+                                  <w:color w:val="1A1A1A"/>
+                                  <w:sz w:val="26"/>
+                                  <w:szCs w:val="26"/>
+                                </w:rPr>
+                                <w:t xml:space="preserve">   </w:t>
+                              </w:r>
+                            </w:p>
+                          </w:tc>
+                        </w:tr>
+                        <w:tr>
+                          <w:tc>
+                            <w:tcPr>
+                              <w:tcW w:type="dxa" w:w="520"/>
+                              <w:tcBorders>
+                                <w:top w:val="none" w:color="FFFFFF" w:sz="0"/>
+                                <w:left w:val="none" w:color="FFFFFF" w:sz="0"/>
+                                <w:bottom w:val="none" w:color="FFFFFF" w:sz="0"/>
+                                <w:right w:val="none" w:color="FFFFFF" w:sz="0"/>
+                              </w:tcBorders>
+                              <w:tcMar>
+                                <w:top w:type="dxa" w:w="0"/>
+                                <w:left w:type="dxa" w:w="30"/>
+                                <w:bottom w:type="dxa" w:w="0"/>
+                                <w:right w:type="dxa" w:w="30"/>
+                              </w:tcMar>
+                            </w:tcPr>
+                            <w:p>
+                              <w:pPr>
+                                <w:spacing w:after="0" w:line="330"/>
+                                <w:jc w:val="center"/>
+                              </w:pPr>
+                              <w:r>
+                                <w:rPr>
+                                  <w:rFonts w:ascii="Consolas" w:cs="Consolas" w:eastAsia="Consolas" w:hAnsi="Consolas"/>
+                                  <w:b/>
+                                  <w:bCs/>
+                                  <w:color w:val="1A1A1A"/>
+                                  <w:sz w:val="26"/>
+                                  <w:szCs w:val="26"/>
+                                </w:rPr>
+                                <w:t xml:space="preserve">   </w:t>
+                              </w:r>
+                            </w:p>
+                          </w:tc>
+                        </w:tr>
+                      </w:tbl>
+                      <w:p/>
+                    </w:tc>
+                  </w:tr>
+                </w:tbl>
+                <w:p>
+                  <w:pPr>
+                    <w:spacing w:after="0" w:line="120" w:lineRule="exact"/>
+                  </w:pPr>
+                </w:p>
+              </w:tc>
+              <w:tc>
+                <w:tcPr>
+                  <w:tcW w:type="dxa" w:w="4510"/>
+                  <w:tcBorders>
+                    <w:top w:val="none" w:color="FFFFFF" w:sz="0"/>
+                    <w:left w:val="none" w:color="FFFFFF" w:sz="0"/>
+                    <w:bottom w:val="none" w:color="FFFFFF" w:sz="0"/>
+                    <w:right w:val="none" w:color="FFFFFF" w:sz="0"/>
+                  </w:tcBorders>
+                  <w:tcMar>
+                    <w:top w:type="dxa" w:w="30"/>
+                    <w:left w:type="dxa" w:w="0"/>
+                    <w:bottom w:type="dxa" w:w="60"/>
+                    <w:right w:type="dxa" w:w="0"/>
+                  </w:tcMar>
+                </w:tcPr>
+                <w:tbl>
+                  <w:tblPr>
+                    <w:tblW w:type="dxa" w:w="3180"/>
+                    <w:jc w:val="left"/>
+                    <w:tblBorders>
+                      <w:top w:val="single" w:color="auto" w:sz="4"/>
+                      <w:left w:val="single" w:color="auto" w:sz="4"/>
+                      <w:bottom w:val="single" w:color="auto" w:sz="4"/>
+                      <w:right w:val="single" w:color="auto" w:sz="4"/>
+                      <w:insideH w:val="single" w:color="auto" w:sz="4"/>
+                      <w:insideV w:val="single" w:color="auto" w:sz="4"/>
+                    </w:tblBorders>
+                  </w:tblPr>
+                  <w:tblGrid>
+                    <w:gridCol w:w="700"/>
+                    <w:gridCol w:w="520"/>
+                    <w:gridCol w:w="700"/>
+                    <w:gridCol w:w="520"/>
+                    <w:gridCol w:w="740"/>
+                  </w:tblGrid>
+                  <w:tr>
+                    <w:tc>
+                      <w:tcPr>
+                        <w:tcW w:type="dxa" w:w="700"/>
+                        <w:tcBorders>
+                          <w:top w:val="none" w:color="FFFFFF" w:sz="0"/>
+                          <w:left w:val="none" w:color="FFFFFF" w:sz="0"/>
+                          <w:bottom w:val="none" w:color="FFFFFF" w:sz="0"/>
+                          <w:right w:val="none" w:color="FFFFFF" w:sz="0"/>
+                        </w:tcBorders>
+                        <w:tcMar>
+                          <w:top w:type="dxa" w:w="30"/>
+                          <w:left w:type="dxa" w:w="20"/>
+                          <w:bottom w:type="dxa" w:w="30"/>
+                          <w:right w:type="dxa" w:w="20"/>
+                        </w:tcMar>
+                        <w:vAlign w:val="center"/>
+                      </w:tcPr>
+                      <w:tbl>
+                        <w:tblPr>
+                          <w:tblW w:type="dxa" w:w="600"/>
+                          <w:jc w:val="center"/>
+                          <w:tblBorders>
+                            <w:top w:val="single" w:color="auto" w:sz="4"/>
+                            <w:left w:val="single" w:color="auto" w:sz="4"/>
+                            <w:bottom w:val="single" w:color="auto" w:sz="4"/>
+                            <w:right w:val="single" w:color="auto" w:sz="4"/>
+                            <w:insideH w:val="none" w:color="FFFFFF" w:sz="0"/>
+                            <w:insideV w:val="single" w:color="auto" w:sz="4"/>
+                          </w:tblBorders>
+                        </w:tblPr>
+                        <w:tblGrid>
+                          <w:gridCol w:w="600"/>
+                        </w:tblGrid>
+                        <w:tr>
+                          <w:tc>
+                            <w:tcPr>
+                              <w:tcW w:type="dxa" w:w="520"/>
+                              <w:tcBorders>
+                                <w:top w:val="none" w:color="FFFFFF" w:sz="0"/>
+                                <w:left w:val="none" w:color="FFFFFF" w:sz="0"/>
+                                <w:bottom w:val="single" w:color="1A1A1A" w:sz="8"/>
+                                <w:right w:val="none" w:color="FFFFFF" w:sz="0"/>
+                              </w:tcBorders>
+                              <w:tcMar>
+                                <w:top w:type="dxa" w:w="0"/>
+                                <w:left w:type="dxa" w:w="30"/>
+                                <w:bottom w:type="dxa" w:w="0"/>
+                                <w:right w:type="dxa" w:w="30"/>
+                              </w:tcMar>
+                            </w:tcPr>
+                            <w:p>
+                              <w:pPr>
+                                <w:spacing w:after="0" w:line="230"/>
+                                <w:jc w:val="center"/>
+                              </w:pPr>
+                              <w:r>
+                                <w:rPr>
+                                  <w:rFonts w:ascii="Consolas" w:cs="Consolas" w:eastAsia="Consolas" w:hAnsi="Consolas"/>
+                                  <w:b/>
+                                  <w:bCs/>
+                                  <w:color w:val="1A1A1A"/>
+                                  <w:sz w:val="26"/>
+                                  <w:szCs w:val="26"/>
+                                </w:rPr>
+                                <w:t xml:space="preserve">3</w:t>
+                              </w:r>
+                            </w:p>
+                          </w:tc>
+                        </w:tr>
+                        <w:tr>
+                          <w:tc>
+                            <w:tcPr>
+                              <w:tcW w:type="dxa" w:w="520"/>
+                              <w:tcBorders>
+                                <w:top w:val="none" w:color="FFFFFF" w:sz="0"/>
+                                <w:left w:val="none" w:color="FFFFFF" w:sz="0"/>
+                                <w:bottom w:val="none" w:color="FFFFFF" w:sz="0"/>
+                                <w:right w:val="none" w:color="FFFFFF" w:sz="0"/>
+                              </w:tcBorders>
+                              <w:tcMar>
+                                <w:top w:type="dxa" w:w="0"/>
+                                <w:left w:type="dxa" w:w="30"/>
+                                <w:bottom w:type="dxa" w:w="0"/>
+                                <w:right w:type="dxa" w:w="30"/>
+                              </w:tcMar>
+                            </w:tcPr>
+                            <w:p>
+                              <w:pPr>
+                                <w:spacing w:after="0" w:line="230"/>
+                                <w:jc w:val="center"/>
+                              </w:pPr>
+                              <w:r>
+                                <w:rPr>
+                                  <w:rFonts w:ascii="Consolas" w:cs="Consolas" w:eastAsia="Consolas" w:hAnsi="Consolas"/>
+                                  <w:b/>
+                                  <w:bCs/>
+                                  <w:color w:val="1A1A1A"/>
+                                  <w:sz w:val="26"/>
+                                  <w:szCs w:val="26"/>
+                                </w:rPr>
+                                <w:t xml:space="preserve">4</w:t>
+                              </w:r>
+                            </w:p>
+                          </w:tc>
+                        </w:tr>
+                      </w:tbl>
+                      <w:p/>
+                    </w:tc>
+                    <w:tc>
+                      <w:tcPr>
+                        <w:tcW w:type="dxa" w:w="520"/>
+                        <w:tcBorders>
+                          <w:top w:val="none" w:color="FFFFFF" w:sz="0"/>
+                          <w:left w:val="none" w:color="FFFFFF" w:sz="0"/>
+                          <w:bottom w:val="none" w:color="FFFFFF" w:sz="0"/>
+                          <w:right w:val="none" w:color="FFFFFF" w:sz="0"/>
+                        </w:tcBorders>
+                        <w:tcMar>
+                          <w:top w:type="dxa" w:w="30"/>
+                          <w:left w:type="dxa" w:w="10"/>
+                          <w:bottom w:type="dxa" w:w="30"/>
+                          <w:right w:type="dxa" w:w="10"/>
+                        </w:tcMar>
+                        <w:vAlign w:val="center"/>
+                      </w:tcPr>
+                      <w:p>
+                        <w:pPr>
+                          <w:jc w:val="center"/>
+                        </w:pPr>
+                        <w:r>
+                          <w:rPr>
+                            <w:rFonts w:ascii="Consolas" w:cs="Consolas" w:eastAsia="Consolas" w:hAnsi="Consolas"/>
+                            <w:b/>
+                            <w:bCs/>
+                            <w:color w:val="7A86A8"/>
+                            <w:sz w:val="26"/>
+                            <w:szCs w:val="26"/>
+                          </w:rPr>
+                          <w:t xml:space="preserve">÷</w:t>
+                        </w:r>
+                      </w:p>
+                    </w:tc>
+                    <w:tc>
+                      <w:tcPr>
+                        <w:tcW w:type="dxa" w:w="700"/>
+                        <w:tcBorders>
+                          <w:top w:val="none" w:color="FFFFFF" w:sz="0"/>
+                          <w:left w:val="none" w:color="FFFFFF" w:sz="0"/>
+                          <w:bottom w:val="none" w:color="FFFFFF" w:sz="0"/>
+                          <w:right w:val="none" w:color="FFFFFF" w:sz="0"/>
+                        </w:tcBorders>
+                        <w:tcMar>
+                          <w:top w:type="dxa" w:w="30"/>
+                          <w:left w:type="dxa" w:w="20"/>
+                          <w:bottom w:type="dxa" w:w="30"/>
+                          <w:right w:type="dxa" w:w="20"/>
+                        </w:tcMar>
+                        <w:vAlign w:val="center"/>
+                      </w:tcPr>
+                      <w:tbl>
+                        <w:tblPr>
+                          <w:tblW w:type="dxa" w:w="600"/>
+                          <w:jc w:val="center"/>
+                          <w:tblBorders>
+                            <w:top w:val="single" w:color="auto" w:sz="4"/>
+                            <w:left w:val="single" w:color="auto" w:sz="4"/>
+                            <w:bottom w:val="single" w:color="auto" w:sz="4"/>
+                            <w:right w:val="single" w:color="auto" w:sz="4"/>
+                            <w:insideH w:val="none" w:color="FFFFFF" w:sz="0"/>
+                            <w:insideV w:val="single" w:color="auto" w:sz="4"/>
+                          </w:tblBorders>
+                        </w:tblPr>
+                        <w:tblGrid>
+                          <w:gridCol w:w="600"/>
+                        </w:tblGrid>
+                        <w:tr>
+                          <w:tc>
+                            <w:tcPr>
+                              <w:tcW w:type="dxa" w:w="520"/>
+                              <w:tcBorders>
+                                <w:top w:val="none" w:color="FFFFFF" w:sz="0"/>
+                                <w:left w:val="none" w:color="FFFFFF" w:sz="0"/>
+                                <w:bottom w:val="single" w:color="1A1A1A" w:sz="8"/>
+                                <w:right w:val="none" w:color="FFFFFF" w:sz="0"/>
+                              </w:tcBorders>
+                              <w:tcMar>
+                                <w:top w:type="dxa" w:w="0"/>
+                                <w:left w:type="dxa" w:w="30"/>
+                                <w:bottom w:type="dxa" w:w="0"/>
+                                <w:right w:type="dxa" w:w="30"/>
+                              </w:tcMar>
+                            </w:tcPr>
+                            <w:p>
+                              <w:pPr>
+                                <w:spacing w:after="0" w:line="230"/>
+                                <w:jc w:val="center"/>
+                              </w:pPr>
+                              <w:r>
+                                <w:rPr>
+                                  <w:rFonts w:ascii="Consolas" w:cs="Consolas" w:eastAsia="Consolas" w:hAnsi="Consolas"/>
+                                  <w:b/>
+                                  <w:bCs/>
+                                  <w:color w:val="1A1A1A"/>
+                                  <w:sz w:val="26"/>
+                                  <w:szCs w:val="26"/>
+                                </w:rPr>
+                                <w:t xml:space="preserve">1</w:t>
+                              </w:r>
+                            </w:p>
+                          </w:tc>
+                        </w:tr>
+                        <w:tr>
+                          <w:tc>
+                            <w:tcPr>
+                              <w:tcW w:type="dxa" w:w="520"/>
+                              <w:tcBorders>
+                                <w:top w:val="none" w:color="FFFFFF" w:sz="0"/>
+                                <w:left w:val="none" w:color="FFFFFF" w:sz="0"/>
+                                <w:bottom w:val="none" w:color="FFFFFF" w:sz="0"/>
+                                <w:right w:val="none" w:color="FFFFFF" w:sz="0"/>
+                              </w:tcBorders>
+                              <w:tcMar>
+                                <w:top w:type="dxa" w:w="0"/>
+                                <w:left w:type="dxa" w:w="30"/>
+                                <w:bottom w:type="dxa" w:w="0"/>
+                                <w:right w:type="dxa" w:w="30"/>
+                              </w:tcMar>
+                            </w:tcPr>
+                            <w:p>
+                              <w:pPr>
+                                <w:spacing w:after="0" w:line="230"/>
+                                <w:jc w:val="center"/>
+                              </w:pPr>
+                              <w:r>
+                                <w:rPr>
+                                  <w:rFonts w:ascii="Consolas" w:cs="Consolas" w:eastAsia="Consolas" w:hAnsi="Consolas"/>
+                                  <w:b/>
+                                  <w:bCs/>
+                                  <w:color w:val="1A1A1A"/>
+                                  <w:sz w:val="26"/>
+                                  <w:szCs w:val="26"/>
+                                </w:rPr>
+                                <w:t xml:space="preserve">2</w:t>
+                              </w:r>
+                            </w:p>
+                          </w:tc>
+                        </w:tr>
+                      </w:tbl>
+                      <w:p/>
+                    </w:tc>
+                    <w:tc>
+                      <w:tcPr>
+                        <w:tcW w:type="dxa" w:w="520"/>
+                        <w:tcBorders>
+                          <w:top w:val="none" w:color="FFFFFF" w:sz="0"/>
+                          <w:left w:val="none" w:color="FFFFFF" w:sz="0"/>
+                          <w:bottom w:val="none" w:color="FFFFFF" w:sz="0"/>
+                          <w:right w:val="none" w:color="FFFFFF" w:sz="0"/>
+                        </w:tcBorders>
+                        <w:tcMar>
+                          <w:top w:type="dxa" w:w="30"/>
+                          <w:left w:type="dxa" w:w="10"/>
+                          <w:bottom w:type="dxa" w:w="30"/>
+                          <w:right w:type="dxa" w:w="10"/>
+                        </w:tcMar>
+                        <w:vAlign w:val="center"/>
+                      </w:tcPr>
+                      <w:p>
+                        <w:pPr>
+                          <w:jc w:val="center"/>
+                        </w:pPr>
+                        <w:r>
+                          <w:rPr>
+                            <w:rFonts w:ascii="Consolas" w:cs="Consolas" w:eastAsia="Consolas" w:hAnsi="Consolas"/>
+                            <w:b/>
+                            <w:bCs/>
+                            <w:color w:val="7A86A8"/>
+                            <w:sz w:val="26"/>
+                            <w:szCs w:val="26"/>
+                          </w:rPr>
+                          <w:t xml:space="preserve">=</w:t>
+                        </w:r>
+                      </w:p>
+                    </w:tc>
+                    <w:tc>
+                      <w:tcPr>
+                        <w:tcW w:type="dxa" w:w="740"/>
+                        <w:tcBorders>
+                          <w:top w:val="none" w:color="FFFFFF" w:sz="0"/>
+                          <w:left w:val="none" w:color="FFFFFF" w:sz="0"/>
+                          <w:bottom w:val="none" w:color="FFFFFF" w:sz="0"/>
+                          <w:right w:val="none" w:color="FFFFFF" w:sz="0"/>
+                        </w:tcBorders>
+                        <w:tcMar>
+                          <w:top w:type="dxa" w:w="30"/>
+                          <w:left w:type="dxa" w:w="20"/>
+                          <w:bottom w:type="dxa" w:w="30"/>
+                          <w:right w:type="dxa" w:w="20"/>
+                        </w:tcMar>
+                        <w:vAlign w:val="center"/>
+                      </w:tcPr>
+                      <w:tbl>
+                        <w:tblPr>
+                          <w:tblW w:type="dxa" w:w="640"/>
+                          <w:jc w:val="center"/>
+                          <w:tblBorders>
+                            <w:top w:val="single" w:color="auto" w:sz="4"/>
+                            <w:left w:val="single" w:color="auto" w:sz="4"/>
+                            <w:bottom w:val="single" w:color="auto" w:sz="4"/>
+                            <w:right w:val="single" w:color="auto" w:sz="4"/>
+                            <w:insideH w:val="none" w:color="FFFFFF" w:sz="0"/>
+                            <w:insideV w:val="single" w:color="auto" w:sz="4"/>
+                          </w:tblBorders>
+                        </w:tblPr>
+                        <w:tblGrid>
+                          <w:gridCol w:w="640"/>
+                        </w:tblGrid>
+                        <w:tr>
+                          <w:tc>
+                            <w:tcPr>
+                              <w:tcW w:type="dxa" w:w="520"/>
+                              <w:tcBorders>
+                                <w:top w:val="none" w:color="FFFFFF" w:sz="0"/>
+                                <w:left w:val="none" w:color="FFFFFF" w:sz="0"/>
+                                <w:bottom w:val="single" w:color="1A1A1A" w:sz="8"/>
+                                <w:right w:val="none" w:color="FFFFFF" w:sz="0"/>
+                              </w:tcBorders>
+                              <w:tcMar>
+                                <w:top w:type="dxa" w:w="0"/>
+                                <w:left w:type="dxa" w:w="30"/>
+                                <w:bottom w:type="dxa" w:w="0"/>
+                                <w:right w:type="dxa" w:w="30"/>
+                              </w:tcMar>
+                            </w:tcPr>
+                            <w:p>
+                              <w:pPr>
+                                <w:spacing w:after="0" w:line="330"/>
+                                <w:jc w:val="center"/>
+                              </w:pPr>
+                              <w:r>
+                                <w:rPr>
+                                  <w:rFonts w:ascii="Consolas" w:cs="Consolas" w:eastAsia="Consolas" w:hAnsi="Consolas"/>
+                                  <w:b/>
+                                  <w:bCs/>
+                                  <w:color w:val="1A1A1A"/>
+                                  <w:sz w:val="26"/>
+                                  <w:szCs w:val="26"/>
+                                </w:rPr>
+                                <w:t xml:space="preserve">   </w:t>
+                              </w:r>
+                            </w:p>
+                          </w:tc>
+                        </w:tr>
+                        <w:tr>
+                          <w:tc>
+                            <w:tcPr>
+                              <w:tcW w:type="dxa" w:w="520"/>
+                              <w:tcBorders>
+                                <w:top w:val="none" w:color="FFFFFF" w:sz="0"/>
+                                <w:left w:val="none" w:color="FFFFFF" w:sz="0"/>
+                                <w:bottom w:val="none" w:color="FFFFFF" w:sz="0"/>
+                                <w:right w:val="none" w:color="FFFFFF" w:sz="0"/>
+                              </w:tcBorders>
+                              <w:tcMar>
+                                <w:top w:type="dxa" w:w="0"/>
+                                <w:left w:type="dxa" w:w="30"/>
+                                <w:bottom w:type="dxa" w:w="0"/>
+                                <w:right w:type="dxa" w:w="30"/>
+                              </w:tcMar>
+                            </w:tcPr>
+                            <w:p>
+                              <w:pPr>
+                                <w:spacing w:after="0" w:line="330"/>
+                                <w:jc w:val="center"/>
+                              </w:pPr>
+                              <w:r>
+                                <w:rPr>
+                                  <w:rFonts w:ascii="Consolas" w:cs="Consolas" w:eastAsia="Consolas" w:hAnsi="Consolas"/>
+                                  <w:b/>
+                                  <w:bCs/>
+                                  <w:color w:val="1A1A1A"/>
+                                  <w:sz w:val="26"/>
+                                  <w:szCs w:val="26"/>
+                                </w:rPr>
+                                <w:t xml:space="preserve">   </w:t>
+                              </w:r>
+                            </w:p>
+                          </w:tc>
+                        </w:tr>
+                      </w:tbl>
+                      <w:p/>
+                    </w:tc>
+                  </w:tr>
+                </w:tbl>
+                <w:p>
+                  <w:pPr>
+                    <w:spacing w:after="0" w:line="120" w:lineRule="exact"/>
+                  </w:pPr>
+                </w:p>
+              </w:tc>
+            </w:tr>
+          </w:tbl>
           <w:p>
             <w:pPr>
-              <w:spacing w:after="50" w:line="300"/>
+              <w:spacing w:after="0" w:line="120" w:lineRule="exact"/>
             </w:pPr>
-            <w:r>
-              <w:rPr>
-                <w:rFonts w:ascii="Consolas" w:cs="Consolas" w:eastAsia="Consolas" w:hAnsi="Consolas"/>
-                <w:b/>
-                <w:bCs/>
-                <w:color w:val="1A1A1A"/>
-                <w:sz w:val="24"/>
-                <w:szCs w:val="24"/>
-              </w:rPr>
-              <w:t xml:space="preserve">1/2 + 1/3 = ______        2/3 × 3/4 = ______</w:t>
-            </w:r>
-          </w:p>
-          <w:p>
-            <w:pPr>
-              <w:spacing w:after="50" w:line="300"/>
-            </w:pPr>
-            <w:r>
-              <w:rPr>
-                <w:rFonts w:ascii="Consolas" w:cs="Consolas" w:eastAsia="Consolas" w:hAnsi="Consolas"/>
-                <w:b/>
-                <w:bCs/>
-                <w:color w:val="1A1A1A"/>
-                <w:sz w:val="24"/>
-                <w:szCs w:val="24"/>
-              </w:rPr>
-              <w:t xml:space="preserve">5/6 − 1/4 = ______        3/4 ÷ 1/2 = ______</w:t>
-            </w:r>
           </w:p>
         </w:tc>
       </w:tr>
@@ -519,19 +2481,6 @@
           <w:szCs w:val="26"/>
         </w:rPr>
         <w:t xml:space="preserve">Find and fix the mistake</w:t>
-      </w:r>
-    </w:p>
-    <w:p>
-      <w:pPr>
-        <w:spacing w:after="105" w:line="272"/>
-      </w:pPr>
-      <w:r>
-        <w:rPr>
-          <w:color w:val="222222"/>
-          <w:sz w:val="22"/>
-          <w:szCs w:val="22"/>
-        </w:rPr>
-        <w:t xml:space="preserve">Adding 3.5 + 12, this student lined up the right-hand digits instead of the points and got 4.7. Find the error and give the correct answer.</w:t>
       </w:r>
     </w:p>
     <w:tbl>
@@ -600,7 +2549,7 @@
                 <w:sz w:val="21"/>
                 <w:szCs w:val="21"/>
               </w:rPr>
-              <w:t xml:space="preserve">Correct answer: ______   (line up the points: 3.5 + 12.0)</w:t>
+              <w:t xml:space="preserve">Correct answer: ______</w:t>
             </w:r>
           </w:p>
         </w:tc>
@@ -618,7 +2567,7 @@
           <w:sz w:val="20"/>
           <w:szCs w:val="20"/>
         </w:rPr>
-        <w:t xml:space="preserve">A digit in the wrong place is still wrong. Line up the points.  ★</w:t>
+        <w:t xml:space="preserve">Line up the points.  ★</w:t>
       </w:r>
     </w:p>
     <w:sectPr>

</xml_diff>